<commit_message>
docs: redraw manuscript figures and align supplement
</commit_message>
<xml_diff>
--- a/paper/CXT-Fish_IMTS_Final_ConstructValidity_Manuscript_revised.docx
+++ b/paper/CXT-Fish_IMTS_Final_ConstructValidity_Manuscript_revised.docx
@@ -2879,7 +2879,7 @@
         <w:widowControl w:val="1"/>
       </w:pPr>
       <w:r>
-        <w:t>The frozen outer protocol recorded clean macro-F1, tail F1, and group-balanced accuracy as primary recognition metrics and donor-context quantities as secondary robustness measures. The manuscript-level primary robustness estimand is the paired difference in cross-class donor-context-composite macro-F1. We report one conditional paired group-cluster bootstrap interval for that estimand rather than presenting a correlated family of robustness measures as independent inferential endpoints. This focus is a reporting choice for the final synthesis and does not upgrade the same-corpus design to independent validation.</w:t>
+        <w:t>The frozen outer protocol recorded clean macro-F1, tail F1, and group-balanced accuracy as primary recognition metrics and donor-context quantities as secondary robustness measures. For the final manuscript synthesis, we report a conditional bootstrap interval for one focal robustness contrast: the paired difference in cross-class donor-context-composite macro-F1. We report this single interval rather than presenting a correlated family of robustness measures as independent inferential endpoints. This reporting focus does not upgrade the same-corpus design to independent validation.</w:t>
       </w:r>
     </w:p>
     <w:p>
@@ -3996,10 +3996,7 @@
         <w:widowControl w:val="1"/>
       </w:pPr>
       <w:r>
-        <w:rPr>
-          <w:i w:val="0"/>
-        </w:rPr>
-        <w:t>The near-equality of constant-fill and shuffled-mask conditions argues against the recipient fish-hole shape being the sole source of the background diagnostic signal. The lower but still substantial inpainted-background result is consistent with both residual environmental/camera context and artifacts induced by subject removal. These experiments therefore justify the term contextual shortcut availability but not a causal claim that the natural background alone determines species identity (Fig. 3).</w:t>
+        <w:t>The near-equality of constant-fill and shuffled-mask conditions argues against the recipient fish-hole shape being the sole source of the background diagnostic signal. The lower but still substantial inpainted-background result is consistent with both residual environmental/camera context and artifacts induced by subject removal. These experiments demonstrate substantial predictive non-subject/contextual signal availability, but not a causal claim that the natural background alone determines species identity. We reserve the stronger shortcut-susceptibility interpretation for failures exposed by the conflicting-context interventions (Fig. 3).</w:t>
       </w:r>
     </w:p>
     <w:p>
@@ -5192,7 +5189,7 @@
         <w:widowControl w:val="1"/>
       </w:pPr>
       <w:r>
-        <w:t>Table 5 Main same-corpus frozen ResNet18 group-disjoint re-evaluation across three folds × three seeds. Values are equal-weight means ± sample SD across the nine fold–seed cells. Paired differences are computed from unrounded cell-level values. The cross-class composite interval is the manuscript's conditional paired group-cluster bootstrap interval.</w:t>
+        <w:t>Table 5 Main same-corpus frozen ResNet18 group-disjoint re-evaluation across three folds × three seeds. Values are equal-weight means ± sample SD across the nine fold–seed cells. Paired differences are computed from unrounded cell-level values. The cross-class composite interval is the conditional paired group-cluster bootstrap interval reported for the focal robustness contrast.</w:t>
       </w:r>
     </w:p>
     <w:tbl>
@@ -6535,22 +6532,8 @@
             </w:tcMar>
           </w:tcPr>
           <w:p>
-            <w:pPr>
-              <w:spacing w:after="0" w:before="0"/>
-            </w:pPr>
-            <w:r>
-              <w:rPr>
-                <w:rFonts w:ascii="Times New Roman" w:hAnsi="Times New Roman" w:eastAsia="Times New Roman"/>
-                <w:sz w:val="16"/>
-              </w:rPr>
-            </w:r>
-            <w:r>
-              <w:rPr>
-                <w:rFonts w:ascii="Times New Roman" w:hAnsi="Times New Roman" w:eastAsia="Times New Roman"/>
-                <w:b w:val="0"/>
-                <w:sz w:val="16"/>
-              </w:rPr>
-              <w:t>95% CI +6.13 to +8.20 pp</w:t>
+            <w:r>
+              <w:t>Conditional bootstrap interval: +6.13 to +8.20 pp</w:t>
             </w:r>
           </w:p>
         </w:tc>
@@ -6769,7 +6752,7 @@
         <w:widowControl w:val="1"/>
       </w:pPr>
       <w:r>
-        <w:t>The effect was substantially larger under conflicting donor context. Cross-class donor-context-composite macro-F1 increased from 0.5189 to 0.5913. The equal-weight paired improvement was 7.24 percentage points, and the 5,000-replicate paired group-cluster bootstrap gave a 95% interval of +6.13 to +8.20 points. Eight of nine cells improved. DAR-flip decreased from 0.2146 to 0.1792 and was lower for CXT-Fish in all nine paired cells. The main frozen result is therefore reduced susceptibility to conflicting donor context, not improved ordinary-view recognition (Table 5; Fig. 6).</w:t>
+        <w:t>The effect was substantially larger under conflicting donor context. Cross-class donor-context-composite macro-F1 increased from 0.5189 to 0.5913. The equal-weight paired improvement was 7.24 percentage points, and the 5,000-replicate paired group-cluster bootstrap gave a conditional paired group-cluster bootstrap 95% interval of +6.13 to +8.20 points. Eight of nine cells improved. DAR-flip decreased from 0.2146 to 0.1792 and was lower for CXT-Fish in all nine paired cells. The main frozen result is therefore reduced susceptibility to conflicting donor context, not improved ordinary-view recognition (Table 5; Fig. 6).</w:t>
       </w:r>
     </w:p>
     <w:p>
@@ -9050,7 +9033,7 @@
     <w:p>
       <w:pPr/>
       <w:r>
-        <w:t>We therefore repeated the frozen-pair evaluation after suppressing the donor subject while retaining the same recipient, donor assignment, recipient mask, checkpoint, and compositing geometry. The equal-weight CXT-Fish–F0 difference was +10.48 percentage points, with an exploratory 5,000-replicate conditional percentile interval of +9.38 to +11.61 points. All nine fold–seed cells remained positive, although the magnitude varied substantially across cells. A post-hoc donor-species-equal-weight correctness sensitivity also remained positive; detailed donor-species and residual-bin heterogeneity are reported in Supplementary Tables S6–S7. This analysis narrows the visible-donor-subject explanation but does not establish natural-background or external-domain robustness.</w:t>
+        <w:t>We therefore repeated the frozen-pair evaluation after suppressing the donor subject while retaining the same recipient, donor assignment, recipient mask, checkpoint, and compositing geometry. The equal-weight CXT-Fish–F0 difference was +10.48 percentage points, with an exploratory 5,000-replicate conditional percentile interval of +9.38 to +11.61 points. All nine fold–seed cells remained positive, although the magnitude varied substantially across cells. A post-hoc donor-species-equal-weight correctness sensitivity also remained positive; detailed donor-species and residual-bin heterogeneity are reported in Supplementary Tables S7–S8. This analysis narrows the visible-donor-subject explanation but does not establish natural-background or external-domain robustness.</w:t>
       </w:r>
     </w:p>
     <w:p>
@@ -11138,15 +11121,8 @@
             </w:tcMar>
           </w:tcPr>
           <w:p>
-            <w:pPr>
-              <w:spacing w:after="0"/>
-            </w:pPr>
-            <w:r>
-              <w:rPr>
-                <w:rFonts w:ascii="Times New Roman" w:hAnsi="Times New Roman" w:eastAsia="Times New Roman"/>
-                <w:sz w:val="17"/>
-              </w:rPr>
-              <w:t>Final inferential interval</w:t>
+            <w:r>
+              <w:t>Conditional main bootstrap interval</w:t>
             </w:r>
           </w:p>
         </w:tc>

</xml_diff>